<commit_message>
Publish final CS 499 ePortfolio
Add the professional self-assessment and code-review materials, polish the reviewer flow and accessibility, update all three enhancement categories, and preserve verified evidence for 127 passing checks.
</commit_message>
<xml_diff>
--- a/Week-4_Algorithms-and-Data-Structures/Madison_Parker_CS499_Milestone3_Algorithms_Narrative.docx
+++ b/Week-4_Algorithms-and-Data-Structures/Madison_Parker_CS499_Milestone3_Algorithms_Narrative.docx
@@ -146,11 +146,13 @@
     <w:p>
       <w:pPr>
         <w:pStyle w:val="Heading1"/>
+        <w:keepNext/>
         <w:spacing w:line="480" w:lineRule="auto" w:before="0" w:after="0"/>
       </w:pPr>
       <w:r>
         <w:rPr>
           <w:rFonts w:ascii="Times New Roman" w:hAnsi="Times New Roman" w:eastAsia="Times New Roman" w:cs="Times New Roman"/>
+          <w:b/>
           <w:color w:val="000000"/>
           <w:sz w:val="24"/>
         </w:rPr>
@@ -186,11 +188,13 @@
     <w:p>
       <w:pPr>
         <w:pStyle w:val="Heading2"/>
+        <w:keepNext/>
         <w:spacing w:line="480" w:lineRule="auto" w:before="0" w:after="0"/>
       </w:pPr>
       <w:r>
         <w:rPr>
           <w:rFonts w:ascii="Times New Roman" w:hAnsi="Times New Roman" w:eastAsia="Times New Roman" w:cs="Times New Roman"/>
+          <w:b/>
           <w:color w:val="000000"/>
           <w:sz w:val="24"/>
         </w:rPr>
@@ -226,11 +230,13 @@
     <w:p>
       <w:pPr>
         <w:pStyle w:val="Heading1"/>
+        <w:keepNext/>
         <w:spacing w:line="480" w:lineRule="auto" w:before="0" w:after="0"/>
       </w:pPr>
       <w:r>
         <w:rPr>
           <w:rFonts w:ascii="Times New Roman" w:hAnsi="Times New Roman" w:eastAsia="Times New Roman" w:cs="Times New Roman"/>
+          <w:b/>
           <w:color w:val="000000"/>
           <w:sz w:val="24"/>
         </w:rPr>
@@ -254,7 +260,7 @@
       <w:tblPr>
         <w:tblStyle w:val="TableGrid"/>
         <w:tblW w:type="dxa" w:w="9360"/>
-        <w:tblLayout w:type="fixed"/>
+        <w:tblLayout w:type="autofit"/>
         <w:tblLook w:firstColumn="1" w:firstRow="1" w:lastColumn="0" w:lastRow="0" w:noHBand="0" w:noVBand="1" w:val="04A0"/>
         <w:tblInd w:type="dxa" w:w="120"/>
         <w:tblBorders>
@@ -619,11 +625,13 @@
     <w:p>
       <w:pPr>
         <w:pStyle w:val="Heading1"/>
+        <w:keepNext/>
         <w:spacing w:line="480" w:lineRule="auto" w:before="0" w:after="0"/>
       </w:pPr>
       <w:r>
         <w:rPr>
           <w:rFonts w:ascii="Times New Roman" w:hAnsi="Times New Roman" w:eastAsia="Times New Roman" w:cs="Times New Roman"/>
+          <w:b/>
           <w:color w:val="000000"/>
           <w:sz w:val="24"/>
         </w:rPr>
@@ -653,17 +661,19 @@
           <w:color w:val="000000"/>
           <w:sz w:val="24"/>
         </w:rPr>
-        <w:t>The collection is currently small and in memory, so each new search performs one traversal of the stored values. ContactService.searchByLastName normalizes the query with Locale.ROOT and matches it against lowercased last names. TaskService.searchByKeyword checks both the task name and description. AppointmentService.findByDateRange validates copied start and end values and includes records on both boundaries. Each stream pipeline filters, maps each match through a model copy constructor, applies an explicit comparator, materializes the list, and returns List.copyOf. Oracle distinguishes collections, which store and expose elements, from streams, which describe aggregate operations over a source; the code uses that pipeline only for retrieval and does not modify the map while it is traversed (Oracle, n.d.-d).</w:t>
+        <w:t>The collection is currently small and in memory, so each new search performs one traversal of the stored values. ContactService.searchByLastName normalizes the query with Locale.ROOT and matches it against lowercased last names. TaskService.searchByKeyword checks both the task name and description. AppointmentService.findByDateRange validates start and end values as immutable primitive timestamps and includes records on both boundaries. Each stream pipeline filters, maps each match through a model copy constructor, applies a reusable comparator, and materializes an unmodifiable list with Stream.toList. Oracle distinguishes collections, which store and expose elements, from streams, which describe aggregate operations over a source; the code uses that pipeline only for retrieval and does not modify the map while it is traversed (Oracle, n.d.-d).</w:t>
       </w:r>
     </w:p>
     <w:p>
       <w:pPr>
         <w:pStyle w:val="Heading1"/>
+        <w:keepNext/>
         <w:spacing w:line="480" w:lineRule="auto" w:before="0" w:after="0"/>
       </w:pPr>
       <w:r>
         <w:rPr>
           <w:rFonts w:ascii="Times New Roman" w:hAnsi="Times New Roman" w:eastAsia="Times New Roman" w:cs="Times New Roman"/>
+          <w:b/>
           <w:color w:val="000000"/>
           <w:sz w:val="24"/>
         </w:rPr>
@@ -673,11 +683,13 @@
     <w:p>
       <w:pPr>
         <w:pStyle w:val="Heading2"/>
+        <w:keepNext/>
         <w:spacing w:line="480" w:lineRule="auto" w:before="0" w:after="0"/>
       </w:pPr>
       <w:r>
         <w:rPr>
           <w:rFonts w:ascii="Times New Roman" w:hAnsi="Times New Roman" w:eastAsia="Times New Roman" w:cs="Times New Roman"/>
+          <w:b/>
           <w:color w:val="000000"/>
           <w:sz w:val="24"/>
         </w:rPr>
@@ -700,11 +712,13 @@
     <w:p>
       <w:pPr>
         <w:pStyle w:val="Heading2"/>
+        <w:keepNext/>
         <w:spacing w:line="480" w:lineRule="auto" w:before="0" w:after="0"/>
       </w:pPr>
       <w:r>
         <w:rPr>
           <w:rFonts w:ascii="Times New Roman" w:hAnsi="Times New Roman" w:eastAsia="Times New Roman" w:cs="Times New Roman"/>
+          <w:b/>
           <w:color w:val="000000"/>
           <w:sz w:val="24"/>
         </w:rPr>
@@ -727,11 +741,13 @@
     <w:p>
       <w:pPr>
         <w:pStyle w:val="Heading2"/>
+        <w:keepNext/>
         <w:spacing w:line="480" w:lineRule="auto" w:before="0" w:after="0"/>
       </w:pPr>
       <w:r>
         <w:rPr>
           <w:rFonts w:ascii="Times New Roman" w:hAnsi="Times New Roman" w:eastAsia="Times New Roman" w:cs="Times New Roman"/>
+          <w:b/>
           <w:color w:val="000000"/>
           <w:sz w:val="24"/>
         </w:rPr>
@@ -754,11 +770,13 @@
     <w:p>
       <w:pPr>
         <w:pStyle w:val="Heading2"/>
+        <w:keepNext/>
         <w:spacing w:line="480" w:lineRule="auto" w:before="0" w:after="0"/>
       </w:pPr>
       <w:r>
         <w:rPr>
           <w:rFonts w:ascii="Times New Roman" w:hAnsi="Times New Roman" w:eastAsia="Times New Roman" w:cs="Times New Roman"/>
+          <w:b/>
           <w:color w:val="000000"/>
           <w:sz w:val="24"/>
         </w:rPr>
@@ -794,11 +812,13 @@
     <w:p>
       <w:pPr>
         <w:pStyle w:val="Heading1"/>
+        <w:keepNext/>
         <w:spacing w:line="480" w:lineRule="auto" w:before="0" w:after="0"/>
       </w:pPr>
       <w:r>
         <w:rPr>
           <w:rFonts w:ascii="Times New Roman" w:hAnsi="Times New Roman" w:eastAsia="Times New Roman" w:cs="Times New Roman"/>
+          <w:b/>
           <w:color w:val="000000"/>
           <w:sz w:val="24"/>
         </w:rPr>
@@ -809,7 +829,7 @@
       <w:tblPr>
         <w:tblStyle w:val="TableGrid"/>
         <w:tblW w:type="dxa" w:w="9360"/>
-        <w:tblLayout w:type="fixed"/>
+        <w:tblLayout w:type="autofit"/>
         <w:tblLook w:firstColumn="1" w:firstRow="1" w:lastColumn="0" w:lastRow="0" w:noHBand="0" w:noVBand="1" w:val="04A0"/>
         <w:tblInd w:type="dxa" w:w="120"/>
         <w:tblBorders>
@@ -1277,17 +1297,31 @@
           <w:color w:val="000000"/>
           <w:sz w:val="24"/>
         </w:rPr>
-        <w:t>The implementation filters before sorting. Sorting all n records and then removing nonmatches would perform unnecessary comparisons when a query is selective. Sorting only m matches preserves deterministic output at a lower cost in that common case. List.copyOf then produces an unmodifiable result list; Oracle specifies that its elements cannot be added, removed, or replaced through the returned list (Oracle, n.d.-c). That guarantee alone is shallow because a contained model can still be mutable. The preceding map(Contact::new), map(Task::new), or map(Appointment::new) step is therefore necessary. The combination prevents both structural list changes and mutation of the service's stored records through a returned element.</w:t>
+        <w:t>The implementation filters before sorting. Sorting all n records and then removing nonmatches would perform unnecessary comparisons when a query is selective. Sorting only m matches preserves deterministic output at a lower cost in that common case. Stream.toList then produces an unmodifiable result list; Oracle specifies that its elements cannot be added, removed, or replaced through the returned list (Oracle, n.d.-c). That guarantee alone is shallow because a contained model can still be mutable. The preceding map(Contact::new), map(Task::new), or map(Appointment::new) step is therefore necessary. The combination prevents both structural list changes and mutation of the service's stored records through a returned element.</w:t>
+      </w:r>
+    </w:p>
+    <w:p>
+      <w:pPr>
+        <w:spacing w:line="480" w:lineRule="auto" w:before="0" w:after="0"/>
+      </w:pPr>
+      <w:r>
+        <w:rPr>
+          <w:rFonts w:ascii="Times New Roman" w:hAnsi="Times New Roman" w:eastAsia="Times New Roman" w:cs="Times New Roman"/>
+          <w:sz w:val="24"/>
+        </w:rPr>
+        <w:t>The final performance pass preserves these asymptotic bounds while reducing temporary allocation. Comparator chains are stored as reusable class constants instead of being rebuilt for every query. Returning Stream.toList directly avoids copying an already unmodifiable result, and appointment retrieval compares primitive epoch-millisecond values so filtering and sorting do not repeatedly allocate defensive Date objects. The model-copy step remains because it protects stored state.</w:t>
       </w:r>
     </w:p>
     <w:p>
       <w:pPr>
         <w:pStyle w:val="Heading2"/>
+        <w:keepNext/>
         <w:spacing w:line="480" w:lineRule="auto" w:before="0" w:after="0"/>
       </w:pPr>
       <w:r>
         <w:rPr>
           <w:rFonts w:ascii="Times New Roman" w:hAnsi="Times New Roman" w:eastAsia="Times New Roman" w:cs="Times New Roman"/>
+          <w:b/>
           <w:color w:val="000000"/>
           <w:sz w:val="24"/>
         </w:rPr>
@@ -1310,11 +1344,13 @@
     <w:p>
       <w:pPr>
         <w:pStyle w:val="Heading2"/>
+        <w:keepNext/>
         <w:spacing w:line="480" w:lineRule="auto" w:before="0" w:after="0"/>
       </w:pPr>
       <w:r>
         <w:rPr>
           <w:rFonts w:ascii="Times New Roman" w:hAnsi="Times New Roman" w:eastAsia="Times New Roman" w:cs="Times New Roman"/>
+          <w:b/>
           <w:color w:val="000000"/>
           <w:sz w:val="24"/>
         </w:rPr>
@@ -1350,11 +1386,13 @@
     <w:p>
       <w:pPr>
         <w:pStyle w:val="Heading1"/>
+        <w:keepNext/>
         <w:spacing w:line="480" w:lineRule="auto" w:before="0" w:after="0"/>
       </w:pPr>
       <w:r>
         <w:rPr>
           <w:rFonts w:ascii="Times New Roman" w:hAnsi="Times New Roman" w:eastAsia="Times New Roman" w:cs="Times New Roman"/>
+          <w:b/>
           <w:color w:val="000000"/>
           <w:sz w:val="24"/>
         </w:rPr>
@@ -1390,11 +1428,13 @@
     <w:p>
       <w:pPr>
         <w:pStyle w:val="Heading1"/>
+        <w:keepNext/>
         <w:spacing w:line="480" w:lineRule="auto" w:before="0" w:after="0"/>
       </w:pPr>
       <w:r>
         <w:rPr>
           <w:rFonts w:ascii="Times New Roman" w:hAnsi="Times New Roman" w:eastAsia="Times New Roman" w:cs="Times New Roman"/>
+          <w:b/>
           <w:color w:val="000000"/>
           <w:sz w:val="24"/>
         </w:rPr>
@@ -1430,11 +1470,13 @@
     <w:p>
       <w:pPr>
         <w:pStyle w:val="Heading2"/>
+        <w:keepNext/>
         <w:spacing w:line="480" w:lineRule="auto" w:before="0" w:after="0"/>
       </w:pPr>
       <w:r>
         <w:rPr>
           <w:rFonts w:ascii="Times New Roman" w:hAnsi="Times New Roman" w:eastAsia="Times New Roman" w:cs="Times New Roman"/>
+          <w:b/>
           <w:color w:val="000000"/>
           <w:sz w:val="24"/>
         </w:rPr>
@@ -1569,11 +1611,13 @@
     <w:p>
       <w:pPr>
         <w:pStyle w:val="Heading1"/>
+        <w:keepNext/>
         <w:spacing w:line="480" w:lineRule="auto" w:before="0" w:after="0"/>
       </w:pPr>
       <w:r>
         <w:rPr>
           <w:rFonts w:ascii="Times New Roman" w:hAnsi="Times New Roman" w:eastAsia="Times New Roman" w:cs="Times New Roman"/>
+          <w:b/>
           <w:color w:val="000000"/>
           <w:sz w:val="24"/>
         </w:rPr>
@@ -1583,11 +1627,13 @@
     <w:p>
       <w:pPr>
         <w:pStyle w:val="Heading2"/>
+        <w:keepNext/>
         <w:spacing w:line="480" w:lineRule="auto" w:before="0" w:after="0"/>
       </w:pPr>
       <w:r>
         <w:rPr>
           <w:rFonts w:ascii="Times New Roman" w:hAnsi="Times New Roman" w:eastAsia="Times New Roman" w:cs="Times New Roman"/>
+          <w:b/>
           <w:color w:val="000000"/>
           <w:sz w:val="24"/>
         </w:rPr>
@@ -1610,11 +1656,13 @@
     <w:p>
       <w:pPr>
         <w:pStyle w:val="Heading2"/>
+        <w:keepNext/>
         <w:spacing w:line="480" w:lineRule="auto" w:before="0" w:after="0"/>
       </w:pPr>
       <w:r>
         <w:rPr>
           <w:rFonts w:ascii="Times New Roman" w:hAnsi="Times New Roman" w:eastAsia="Times New Roman" w:cs="Times New Roman"/>
+          <w:b/>
           <w:color w:val="000000"/>
           <w:sz w:val="24"/>
         </w:rPr>
@@ -1631,17 +1679,19 @@
           <w:color w:val="000000"/>
           <w:sz w:val="24"/>
         </w:rPr>
-        <w:t>Outcome Three is the primary result of this milestone. The enhancement preserves HashMap for expected O(1) exact-ID access under the documented hashing assumptions, adds value traversals for broader retrieval, sorts only matching records with deterministic comparator chains, constructs immutable snapshot results, and evaluates time, space, capacity, and maintenance trade-offs. The analysis also distinguishes the unmodifiable list supplied by List.copyOf from deep immutability of its elements, which is why model copies occur before the final list is created (Oracle, n.d.-b; Oracle, n.d.-c). The final choice is appropriate to the current scale while identifying the specific index structures that could become justified after measurement.</w:t>
+        <w:t>Outcome Three is the primary result of this milestone. The enhancement preserves HashMap for expected O(1) exact-ID access under the documented hashing assumptions, adds value traversals for broader retrieval, sorts only matching records with deterministic comparator chains, constructs immutable snapshot results, and evaluates time, space, capacity, and maintenance trade-offs. The analysis also distinguishes the unmodifiable list supplied by Stream.toList from deep immutability of its elements, which is why model copies occur before the final list is created (Oracle, n.d.-b; Oracle, n.d.-c). The final choice is appropriate to the current scale while identifying the specific index structures that could become justified after measurement.</w:t>
       </w:r>
     </w:p>
     <w:p>
       <w:pPr>
         <w:pStyle w:val="Heading2"/>
+        <w:keepNext/>
         <w:spacing w:line="480" w:lineRule="auto" w:before="0" w:after="0"/>
       </w:pPr>
       <w:r>
         <w:rPr>
           <w:rFonts w:ascii="Times New Roman" w:hAnsi="Times New Roman" w:eastAsia="Times New Roman" w:cs="Times New Roman"/>
+          <w:b/>
           <w:color w:val="000000"/>
           <w:sz w:val="24"/>
         </w:rPr>
@@ -1658,17 +1708,19 @@
           <w:color w:val="000000"/>
           <w:sz w:val="24"/>
         </w:rPr>
-        <w:t>The implementation uses Java streams, Comparator composition, Locale.ROOT normalization, List.copyOf, model copy constructors, Maven organization, and repeatable tests to provide useful retrieval features. Maven's conventional production and test directories keep the cumulative source and test responsibilities recognizable to another Java developer (Apache Maven Project, n.d.). Each technique supports an observable behavior: locale-stable matching, deterministic order, protected results, or reproducible verification. The outcome is supported by the interaction of these tools, not by listing technologies without showing where they affect execution.</w:t>
+        <w:t>The implementation uses Java streams, Comparator composition, Locale.ROOT normalization, Stream.toList, model copy constructors, Maven organization, and repeatable tests to provide useful retrieval features. Maven's conventional production and test directories keep the cumulative source and test responsibilities recognizable to another Java developer (Apache Maven Project, n.d.). Each technique supports an observable behavior: locale-stable matching, deterministic order, protected results, or reproducible verification. The outcome is supported by the interaction of these tools, not by listing technologies without showing where they affect execution.</w:t>
       </w:r>
     </w:p>
     <w:p>
       <w:pPr>
         <w:pStyle w:val="Heading2"/>
+        <w:keepNext/>
         <w:spacing w:line="480" w:lineRule="auto" w:before="0" w:after="0"/>
       </w:pPr>
       <w:r>
         <w:rPr>
           <w:rFonts w:ascii="Times New Roman" w:hAnsi="Times New Roman" w:eastAsia="Times New Roman" w:cs="Times New Roman"/>
+          <w:b/>
           <w:color w:val="000000"/>
           <w:sz w:val="24"/>
         </w:rPr>
@@ -1704,11 +1756,13 @@
     <w:p>
       <w:pPr>
         <w:pStyle w:val="Heading1"/>
+        <w:keepNext/>
         <w:spacing w:line="480" w:lineRule="auto" w:before="0" w:after="0"/>
       </w:pPr>
       <w:r>
         <w:rPr>
           <w:rFonts w:ascii="Times New Roman" w:hAnsi="Times New Roman" w:eastAsia="Times New Roman" w:cs="Times New Roman"/>
+          <w:b/>
           <w:color w:val="000000"/>
           <w:sz w:val="24"/>
         </w:rPr>
@@ -1757,11 +1811,13 @@
     <w:p>
       <w:pPr>
         <w:pStyle w:val="Heading1"/>
+        <w:keepNext/>
         <w:spacing w:line="480" w:lineRule="auto" w:before="0" w:after="0"/>
       </w:pPr>
       <w:r>
         <w:rPr>
           <w:rFonts w:ascii="Times New Roman" w:hAnsi="Times New Roman" w:eastAsia="Times New Roman" w:cs="Times New Roman"/>
+          <w:b/>
           <w:color w:val="000000"/>
           <w:sz w:val="24"/>
         </w:rPr>
@@ -1784,11 +1840,13 @@
     <w:p>
       <w:pPr>
         <w:pStyle w:val="Heading1"/>
+        <w:keepNext/>
         <w:spacing w:line="480" w:lineRule="auto" w:before="0" w:after="0"/>
       </w:pPr>
       <w:r>
         <w:rPr>
           <w:rFonts w:ascii="Times New Roman" w:hAnsi="Times New Roman" w:eastAsia="Times New Roman" w:cs="Times New Roman"/>
+          <w:b/>
           <w:color w:val="000000"/>
           <w:sz w:val="24"/>
         </w:rPr>
@@ -1862,7 +1920,7 @@
           <w:color w:val="000000"/>
           <w:sz w:val="24"/>
         </w:rPr>
-        <w:t>Oracle. (n.d.-c). List.copyOf (Java SE 17 &amp; JDK 17). https://docs.oracle.com/en/java/javase/17/docs/api/java.base/java/util/List.html#copyOf(java.util.Collection)</w:t>
+        <w:t>Oracle. (n.d.-c). Stream.toList (Java SE 17 &amp; JDK 17). https://docs.oracle.com/en/java/javase/17/docs/api/java.base/java/util/stream/Stream.html#toList()</w:t>
       </w:r>
     </w:p>
     <w:p>
@@ -1916,7 +1974,6 @@
     <w:r>
       <w:rPr>
         <w:rFonts w:ascii="Times New Roman" w:hAnsi="Times New Roman" w:eastAsia="Times New Roman" w:cs="Times New Roman"/>
-        <w:color w:val="000000"/>
         <w:sz w:val="24"/>
       </w:rPr>
       <w:t xml:space="preserve">Page </w:t>
@@ -1924,7 +1981,6 @@
     <w:r>
       <w:rPr>
         <w:rFonts w:ascii="Times New Roman" w:hAnsi="Times New Roman" w:eastAsia="Times New Roman" w:cs="Times New Roman"/>
-        <w:color w:val="000000"/>
         <w:sz w:val="24"/>
       </w:rPr>
       <w:fldChar w:fldCharType="begin"/>
@@ -1943,13 +1999,11 @@
     <w:pPr>
       <w:pStyle w:val="Header"/>
       <w:spacing w:after="0" w:line="480" w:lineRule="auto" w:before="0"/>
-      <w:jc w:val="left"/>
+      <w:jc w:val="right"/>
     </w:pPr>
     <w:r>
       <w:rPr>
         <w:rFonts w:ascii="Times New Roman" w:hAnsi="Times New Roman" w:eastAsia="Times New Roman" w:cs="Times New Roman"/>
-        <w:b/>
-        <w:color w:val="000000"/>
         <w:sz w:val="24"/>
       </w:rPr>
       <w:t>Madison Parker | CS 499 | Milestone Three</w:t>

</xml_diff>